<commit_message>
My local changes before pull.
</commit_message>
<xml_diff>
--- a/Docs/RDBMS/DesignExplanation.docx
+++ b/Docs/RDBMS/DesignExplanation.docx
@@ -1,6 +1,6 @@
 
 <file path=word/document.xml><?xml version="1.0" encoding="utf-8"?>
-<w:document xmlns:wpc="http://schemas.microsoft.com/office/word/2010/wordprocessingCanvas" xmlns:mc="http://schemas.openxmlformats.org/markup-compatibility/2006" xmlns:o="urn:schemas-microsoft-com:office:office" xmlns:r="http://schemas.openxmlformats.org/officeDocument/2006/relationships" xmlns:m="http://schemas.openxmlformats.org/officeDocument/2006/math" xmlns:v="urn:schemas-microsoft-com:vml" xmlns:wp14="http://schemas.microsoft.com/office/word/2010/wordprocessingDrawing" xmlns:wp="http://schemas.openxmlformats.org/drawingml/2006/wordprocessingDrawing" xmlns:w10="urn:schemas-microsoft-com:office:word" xmlns:w="http://schemas.openxmlformats.org/wordprocessingml/2006/main" xmlns:w14="http://schemas.microsoft.com/office/word/2010/wordml" xmlns:w15="http://schemas.microsoft.com/office/word/2012/wordml" xmlns:wpg="http://schemas.microsoft.com/office/word/2010/wordprocessingGroup" xmlns:wpi="http://schemas.microsoft.com/office/word/2010/wordprocessingInk" xmlns:wne="http://schemas.microsoft.com/office/word/2006/wordml" xmlns:wps="http://schemas.microsoft.com/office/word/2010/wordprocessingShape" mc:Ignorable="w14 w15 wp14">
+<w:document xmlns:wpc="http://schemas.microsoft.com/office/word/2010/wordprocessingCanvas" xmlns:cx="http://schemas.microsoft.com/office/drawing/2014/chartex" xmlns:cx1="http://schemas.microsoft.com/office/drawing/2015/9/8/chartex" xmlns:cx2="http://schemas.microsoft.com/office/drawing/2015/10/21/chartex" xmlns:cx3="http://schemas.microsoft.com/office/drawing/2016/5/9/chartex" xmlns:cx4="http://schemas.microsoft.com/office/drawing/2016/5/10/chartex" xmlns:cx5="http://schemas.microsoft.com/office/drawing/2016/5/11/chartex" xmlns:cx6="http://schemas.microsoft.com/office/drawing/2016/5/12/chartex" xmlns:cx7="http://schemas.microsoft.com/office/drawing/2016/5/13/chartex" xmlns:cx8="http://schemas.microsoft.com/office/drawing/2016/5/14/chartex" xmlns:mc="http://schemas.openxmlformats.org/markup-compatibility/2006" xmlns:aink="http://schemas.microsoft.com/office/drawing/2016/ink" xmlns:am3d="http://schemas.microsoft.com/office/drawing/2017/model3d" xmlns:o="urn:schemas-microsoft-com:office:office" xmlns:oel="http://schemas.microsoft.com/office/2019/extlst" xmlns:r="http://schemas.openxmlformats.org/officeDocument/2006/relationships" xmlns:m="http://schemas.openxmlformats.org/officeDocument/2006/math" xmlns:v="urn:schemas-microsoft-com:vml" xmlns:wp14="http://schemas.microsoft.com/office/word/2010/wordprocessingDrawing" xmlns:wp="http://schemas.openxmlformats.org/drawingml/2006/wordprocessingDrawing" xmlns:w10="urn:schemas-microsoft-com:office:word" xmlns:w="http://schemas.openxmlformats.org/wordprocessingml/2006/main" xmlns:w14="http://schemas.microsoft.com/office/word/2010/wordml" xmlns:w15="http://schemas.microsoft.com/office/word/2012/wordml" xmlns:w16cei="http://schemas.microsoft.com/office/word/2026/wordml/cei" xmlns:w16cex="http://schemas.microsoft.com/office/word/2018/wordml/cex" xmlns:w16cid="http://schemas.microsoft.com/office/word/2016/wordml/cid" xmlns:w16="http://schemas.microsoft.com/office/word/2018/wordml" xmlns:w16du="http://schemas.microsoft.com/office/word/2023/wordml/word16du" xmlns:w16sdtdh="http://schemas.microsoft.com/office/word/2020/wordml/sdtdatahash" xmlns:w16sdtfl="http://schemas.microsoft.com/office/word/2024/wordml/sdtformatlock" xmlns:w16se="http://schemas.microsoft.com/office/word/2015/wordml/symex" xmlns:wpg="http://schemas.microsoft.com/office/word/2010/wordprocessingGroup" xmlns:wpi="http://schemas.microsoft.com/office/word/2010/wordprocessingInk" xmlns:wne="http://schemas.microsoft.com/office/word/2006/wordml" xmlns:wps="http://schemas.microsoft.com/office/word/2010/wordprocessingShape" mc:Ignorable="w14 w15 w16se w16cid w16 w16cex w16sdtdh w16sdtfl w16du wp14">
   <w:body>
     <w:p>
       <w:pPr>
@@ -149,6 +149,14 @@
       <w:tblPr>
         <w:tblW w:w="0" w:type="auto"/>
         <w:tblCellSpacing w:w="15" w:type="dxa"/>
+        <w:tblBorders>
+          <w:top w:val="single" w:sz="4" w:space="0" w:color="auto"/>
+          <w:left w:val="single" w:sz="4" w:space="0" w:color="auto"/>
+          <w:bottom w:val="single" w:sz="4" w:space="0" w:color="auto"/>
+          <w:right w:val="single" w:sz="4" w:space="0" w:color="auto"/>
+          <w:insideH w:val="single" w:sz="4" w:space="0" w:color="auto"/>
+          <w:insideV w:val="single" w:sz="4" w:space="0" w:color="auto"/>
+        </w:tblBorders>
         <w:tblCellMar>
           <w:top w:w="15" w:type="dxa"/>
           <w:left w:w="15" w:type="dxa"/>
@@ -158,9 +166,9 @@
         <w:tblLook w:val="04A0" w:firstRow="1" w:lastRow="0" w:firstColumn="1" w:lastColumn="0" w:noHBand="0" w:noVBand="1"/>
       </w:tblPr>
       <w:tblGrid>
-        <w:gridCol w:w="1839"/>
-        <w:gridCol w:w="4314"/>
-        <w:gridCol w:w="2873"/>
+        <w:gridCol w:w="1856"/>
+        <w:gridCol w:w="4309"/>
+        <w:gridCol w:w="2851"/>
       </w:tblGrid>
       <w:tr>
         <w:trPr>
@@ -2992,7 +3000,6 @@
           <w:szCs w:val="24"/>
           <w:lang w:eastAsia="en-AU"/>
         </w:rPr>
-        <w:lastRenderedPageBreak/>
         <w:t xml:space="preserve">The scoring function also handles a new user correctly. For example, if Kim has no long-term history yet, it does </w:t>
       </w:r>
       <w:r>
@@ -3141,15 +3148,6 @@
         <w:t xml:space="preserve">CALL </w:t>
       </w:r>
       <w:proofErr w:type="spellStart"/>
-      <w:r>
-        <w:rPr>
-          <w:rFonts w:ascii="Courier New" w:eastAsia="Times New Roman" w:hAnsi="Courier New" w:cs="Courier New"/>
-          <w:sz w:val="20"/>
-          <w:szCs w:val="20"/>
-          <w:lang w:eastAsia="en-AU"/>
-        </w:rPr>
-        <w:t>reddust.refresh_session_dimension_</w:t>
-      </w:r>
       <w:proofErr w:type="gramStart"/>
       <w:r>
         <w:rPr>
@@ -3158,6 +3156,26 @@
           <w:szCs w:val="20"/>
           <w:lang w:eastAsia="en-AU"/>
         </w:rPr>
+        <w:t>reddust.refresh</w:t>
+      </w:r>
+      <w:proofErr w:type="gramEnd"/>
+      <w:r>
+        <w:rPr>
+          <w:rFonts w:ascii="Courier New" w:eastAsia="Times New Roman" w:hAnsi="Courier New" w:cs="Courier New"/>
+          <w:sz w:val="20"/>
+          <w:szCs w:val="20"/>
+          <w:lang w:eastAsia="en-AU"/>
+        </w:rPr>
+        <w:t>_session_dimension_</w:t>
+      </w:r>
+      <w:proofErr w:type="gramStart"/>
+      <w:r>
+        <w:rPr>
+          <w:rFonts w:ascii="Courier New" w:eastAsia="Times New Roman" w:hAnsi="Courier New" w:cs="Courier New"/>
+          <w:sz w:val="20"/>
+          <w:szCs w:val="20"/>
+          <w:lang w:eastAsia="en-AU"/>
+        </w:rPr>
         <w:t>scores</w:t>
       </w:r>
       <w:proofErr w:type="spellEnd"/>
@@ -3207,8 +3225,201 @@
           <w:szCs w:val="20"/>
           <w:lang w:eastAsia="en-AU"/>
         </w:rPr>
-        <w:t xml:space="preserve">    '&lt;</w:t>
-      </w:r>
+        <w:t xml:space="preserve">    '&lt;session-</w:t>
+      </w:r>
+      <w:proofErr w:type="spellStart"/>
+      <w:r>
+        <w:rPr>
+          <w:rFonts w:ascii="Courier New" w:eastAsia="Times New Roman" w:hAnsi="Courier New" w:cs="Courier New"/>
+          <w:sz w:val="20"/>
+          <w:szCs w:val="20"/>
+          <w:lang w:eastAsia="en-AU"/>
+        </w:rPr>
+        <w:t>uuid</w:t>
+      </w:r>
+      <w:proofErr w:type="spellEnd"/>
+      <w:r>
+        <w:rPr>
+          <w:rFonts w:ascii="Courier New" w:eastAsia="Times New Roman" w:hAnsi="Courier New" w:cs="Courier New"/>
+          <w:sz w:val="20"/>
+          <w:szCs w:val="20"/>
+          <w:lang w:eastAsia="en-AU"/>
+        </w:rPr>
+        <w:t>&gt;'</w:t>
+      </w:r>
+    </w:p>
+    <w:p>
+      <w:pPr>
+        <w:tabs>
+          <w:tab w:val="left" w:pos="916"/>
+          <w:tab w:val="left" w:pos="1832"/>
+          <w:tab w:val="left" w:pos="2748"/>
+          <w:tab w:val="left" w:pos="3664"/>
+          <w:tab w:val="left" w:pos="4580"/>
+          <w:tab w:val="left" w:pos="5496"/>
+          <w:tab w:val="left" w:pos="6412"/>
+          <w:tab w:val="left" w:pos="7328"/>
+          <w:tab w:val="left" w:pos="8244"/>
+          <w:tab w:val="left" w:pos="9160"/>
+          <w:tab w:val="left" w:pos="10076"/>
+          <w:tab w:val="left" w:pos="10992"/>
+          <w:tab w:val="left" w:pos="11908"/>
+          <w:tab w:val="left" w:pos="12824"/>
+          <w:tab w:val="left" w:pos="13740"/>
+          <w:tab w:val="left" w:pos="14656"/>
+        </w:tabs>
+        <w:spacing w:after="0" w:line="240" w:lineRule="auto"/>
+        <w:rPr>
+          <w:rFonts w:ascii="Courier New" w:eastAsia="Times New Roman" w:hAnsi="Courier New" w:cs="Courier New"/>
+          <w:sz w:val="20"/>
+          <w:szCs w:val="20"/>
+          <w:lang w:eastAsia="en-AU"/>
+        </w:rPr>
+      </w:pPr>
+      <w:r>
+        <w:rPr>
+          <w:rFonts w:ascii="Courier New" w:eastAsia="Times New Roman" w:hAnsi="Courier New" w:cs="Courier New"/>
+          <w:sz w:val="20"/>
+          <w:szCs w:val="20"/>
+          <w:lang w:eastAsia="en-AU"/>
+        </w:rPr>
+        <w:t>);</w:t>
+      </w:r>
+    </w:p>
+    <w:p>
+      <w:pPr>
+        <w:tabs>
+          <w:tab w:val="left" w:pos="916"/>
+          <w:tab w:val="left" w:pos="1832"/>
+          <w:tab w:val="left" w:pos="2748"/>
+          <w:tab w:val="left" w:pos="3664"/>
+          <w:tab w:val="left" w:pos="4580"/>
+          <w:tab w:val="left" w:pos="5496"/>
+          <w:tab w:val="left" w:pos="6412"/>
+          <w:tab w:val="left" w:pos="7328"/>
+          <w:tab w:val="left" w:pos="8244"/>
+          <w:tab w:val="left" w:pos="9160"/>
+          <w:tab w:val="left" w:pos="10076"/>
+          <w:tab w:val="left" w:pos="10992"/>
+          <w:tab w:val="left" w:pos="11908"/>
+          <w:tab w:val="left" w:pos="12824"/>
+          <w:tab w:val="left" w:pos="13740"/>
+          <w:tab w:val="left" w:pos="14656"/>
+        </w:tabs>
+        <w:spacing w:after="0" w:line="240" w:lineRule="auto"/>
+        <w:rPr>
+          <w:rFonts w:ascii="Courier New" w:eastAsia="Times New Roman" w:hAnsi="Courier New" w:cs="Courier New"/>
+          <w:sz w:val="20"/>
+          <w:szCs w:val="20"/>
+          <w:lang w:eastAsia="en-AU"/>
+        </w:rPr>
+      </w:pPr>
+    </w:p>
+    <w:p>
+      <w:pPr>
+        <w:tabs>
+          <w:tab w:val="left" w:pos="916"/>
+          <w:tab w:val="left" w:pos="1832"/>
+          <w:tab w:val="left" w:pos="2748"/>
+          <w:tab w:val="left" w:pos="3664"/>
+          <w:tab w:val="left" w:pos="4580"/>
+          <w:tab w:val="left" w:pos="5496"/>
+          <w:tab w:val="left" w:pos="6412"/>
+          <w:tab w:val="left" w:pos="7328"/>
+          <w:tab w:val="left" w:pos="8244"/>
+          <w:tab w:val="left" w:pos="9160"/>
+          <w:tab w:val="left" w:pos="10076"/>
+          <w:tab w:val="left" w:pos="10992"/>
+          <w:tab w:val="left" w:pos="11908"/>
+          <w:tab w:val="left" w:pos="12824"/>
+          <w:tab w:val="left" w:pos="13740"/>
+          <w:tab w:val="left" w:pos="14656"/>
+        </w:tabs>
+        <w:spacing w:after="0" w:line="240" w:lineRule="auto"/>
+        <w:rPr>
+          <w:rFonts w:ascii="Courier New" w:eastAsia="Times New Roman" w:hAnsi="Courier New" w:cs="Courier New"/>
+          <w:sz w:val="20"/>
+          <w:szCs w:val="20"/>
+          <w:lang w:eastAsia="en-AU"/>
+        </w:rPr>
+      </w:pPr>
+      <w:r>
+        <w:rPr>
+          <w:rFonts w:ascii="Courier New" w:eastAsia="Times New Roman" w:hAnsi="Courier New" w:cs="Courier New"/>
+          <w:sz w:val="20"/>
+          <w:szCs w:val="20"/>
+          <w:lang w:eastAsia="en-AU"/>
+        </w:rPr>
+        <w:t>-- Then calculate and persist dashboard scores:</w:t>
+      </w:r>
+    </w:p>
+    <w:p>
+      <w:pPr>
+        <w:tabs>
+          <w:tab w:val="left" w:pos="916"/>
+          <w:tab w:val="left" w:pos="1832"/>
+          <w:tab w:val="left" w:pos="2748"/>
+          <w:tab w:val="left" w:pos="3664"/>
+          <w:tab w:val="left" w:pos="4580"/>
+          <w:tab w:val="left" w:pos="5496"/>
+          <w:tab w:val="left" w:pos="6412"/>
+          <w:tab w:val="left" w:pos="7328"/>
+          <w:tab w:val="left" w:pos="8244"/>
+          <w:tab w:val="left" w:pos="9160"/>
+          <w:tab w:val="left" w:pos="10076"/>
+          <w:tab w:val="left" w:pos="10992"/>
+          <w:tab w:val="left" w:pos="11908"/>
+          <w:tab w:val="left" w:pos="12824"/>
+          <w:tab w:val="left" w:pos="13740"/>
+          <w:tab w:val="left" w:pos="14656"/>
+        </w:tabs>
+        <w:spacing w:after="0" w:line="240" w:lineRule="auto"/>
+        <w:rPr>
+          <w:rFonts w:ascii="Courier New" w:eastAsia="Times New Roman" w:hAnsi="Courier New" w:cs="Courier New"/>
+          <w:sz w:val="20"/>
+          <w:szCs w:val="20"/>
+          <w:lang w:eastAsia="en-AU"/>
+        </w:rPr>
+      </w:pPr>
+    </w:p>
+    <w:p>
+      <w:pPr>
+        <w:tabs>
+          <w:tab w:val="left" w:pos="916"/>
+          <w:tab w:val="left" w:pos="1832"/>
+          <w:tab w:val="left" w:pos="2748"/>
+          <w:tab w:val="left" w:pos="3664"/>
+          <w:tab w:val="left" w:pos="4580"/>
+          <w:tab w:val="left" w:pos="5496"/>
+          <w:tab w:val="left" w:pos="6412"/>
+          <w:tab w:val="left" w:pos="7328"/>
+          <w:tab w:val="left" w:pos="8244"/>
+          <w:tab w:val="left" w:pos="9160"/>
+          <w:tab w:val="left" w:pos="10076"/>
+          <w:tab w:val="left" w:pos="10992"/>
+          <w:tab w:val="left" w:pos="11908"/>
+          <w:tab w:val="left" w:pos="12824"/>
+          <w:tab w:val="left" w:pos="13740"/>
+          <w:tab w:val="left" w:pos="14656"/>
+        </w:tabs>
+        <w:spacing w:after="0" w:line="240" w:lineRule="auto"/>
+        <w:rPr>
+          <w:rFonts w:ascii="Courier New" w:eastAsia="Times New Roman" w:hAnsi="Courier New" w:cs="Courier New"/>
+          <w:sz w:val="20"/>
+          <w:szCs w:val="20"/>
+          <w:lang w:eastAsia="en-AU"/>
+        </w:rPr>
+      </w:pPr>
+      <w:r>
+        <w:rPr>
+          <w:rFonts w:ascii="Courier New" w:eastAsia="Times New Roman" w:hAnsi="Courier New" w:cs="Courier New"/>
+          <w:sz w:val="20"/>
+          <w:szCs w:val="20"/>
+          <w:lang w:eastAsia="en-AU"/>
+        </w:rPr>
+        <w:t xml:space="preserve">CALL </w:t>
+      </w:r>
+      <w:proofErr w:type="spellStart"/>
       <w:proofErr w:type="gramStart"/>
       <w:r>
         <w:rPr>
@@ -3217,7 +3428,76 @@
           <w:szCs w:val="20"/>
           <w:lang w:eastAsia="en-AU"/>
         </w:rPr>
-        <w:t>session-</w:t>
+        <w:t>reddust.refresh</w:t>
+      </w:r>
+      <w:proofErr w:type="gramEnd"/>
+      <w:r>
+        <w:rPr>
+          <w:rFonts w:ascii="Courier New" w:eastAsia="Times New Roman" w:hAnsi="Courier New" w:cs="Courier New"/>
+          <w:sz w:val="20"/>
+          <w:szCs w:val="20"/>
+          <w:lang w:eastAsia="en-AU"/>
+        </w:rPr>
+        <w:t>_soul_score_</w:t>
+      </w:r>
+      <w:proofErr w:type="gramStart"/>
+      <w:r>
+        <w:rPr>
+          <w:rFonts w:ascii="Courier New" w:eastAsia="Times New Roman" w:hAnsi="Courier New" w:cs="Courier New"/>
+          <w:sz w:val="20"/>
+          <w:szCs w:val="20"/>
+          <w:lang w:eastAsia="en-AU"/>
+        </w:rPr>
+        <w:t>snapshot</w:t>
+      </w:r>
+      <w:proofErr w:type="spellEnd"/>
+      <w:r>
+        <w:rPr>
+          <w:rFonts w:ascii="Courier New" w:eastAsia="Times New Roman" w:hAnsi="Courier New" w:cs="Courier New"/>
+          <w:sz w:val="20"/>
+          <w:szCs w:val="20"/>
+          <w:lang w:eastAsia="en-AU"/>
+        </w:rPr>
+        <w:t>(</w:t>
+      </w:r>
+      <w:proofErr w:type="gramEnd"/>
+    </w:p>
+    <w:p>
+      <w:pPr>
+        <w:tabs>
+          <w:tab w:val="left" w:pos="916"/>
+          <w:tab w:val="left" w:pos="1832"/>
+          <w:tab w:val="left" w:pos="2748"/>
+          <w:tab w:val="left" w:pos="3664"/>
+          <w:tab w:val="left" w:pos="4580"/>
+          <w:tab w:val="left" w:pos="5496"/>
+          <w:tab w:val="left" w:pos="6412"/>
+          <w:tab w:val="left" w:pos="7328"/>
+          <w:tab w:val="left" w:pos="8244"/>
+          <w:tab w:val="left" w:pos="9160"/>
+          <w:tab w:val="left" w:pos="10076"/>
+          <w:tab w:val="left" w:pos="10992"/>
+          <w:tab w:val="left" w:pos="11908"/>
+          <w:tab w:val="left" w:pos="12824"/>
+          <w:tab w:val="left" w:pos="13740"/>
+          <w:tab w:val="left" w:pos="14656"/>
+        </w:tabs>
+        <w:spacing w:after="0" w:line="240" w:lineRule="auto"/>
+        <w:rPr>
+          <w:rFonts w:ascii="Courier New" w:eastAsia="Times New Roman" w:hAnsi="Courier New" w:cs="Courier New"/>
+          <w:sz w:val="20"/>
+          <w:szCs w:val="20"/>
+          <w:lang w:eastAsia="en-AU"/>
+        </w:rPr>
+      </w:pPr>
+      <w:r>
+        <w:rPr>
+          <w:rFonts w:ascii="Courier New" w:eastAsia="Times New Roman" w:hAnsi="Courier New" w:cs="Courier New"/>
+          <w:sz w:val="20"/>
+          <w:szCs w:val="20"/>
+          <w:lang w:eastAsia="en-AU"/>
+        </w:rPr>
+        <w:t xml:space="preserve">    '&lt;user-</w:t>
       </w:r>
       <w:proofErr w:type="spellStart"/>
       <w:r>
@@ -3230,7 +3510,64 @@
         <w:t>uuid</w:t>
       </w:r>
       <w:proofErr w:type="spellEnd"/>
-      <w:proofErr w:type="gramEnd"/>
+      <w:r>
+        <w:rPr>
+          <w:rFonts w:ascii="Courier New" w:eastAsia="Times New Roman" w:hAnsi="Courier New" w:cs="Courier New"/>
+          <w:sz w:val="20"/>
+          <w:szCs w:val="20"/>
+          <w:lang w:eastAsia="en-AU"/>
+        </w:rPr>
+        <w:t>&gt;',</w:t>
+      </w:r>
+    </w:p>
+    <w:p>
+      <w:pPr>
+        <w:tabs>
+          <w:tab w:val="left" w:pos="916"/>
+          <w:tab w:val="left" w:pos="1832"/>
+          <w:tab w:val="left" w:pos="2748"/>
+          <w:tab w:val="left" w:pos="3664"/>
+          <w:tab w:val="left" w:pos="4580"/>
+          <w:tab w:val="left" w:pos="5496"/>
+          <w:tab w:val="left" w:pos="6412"/>
+          <w:tab w:val="left" w:pos="7328"/>
+          <w:tab w:val="left" w:pos="8244"/>
+          <w:tab w:val="left" w:pos="9160"/>
+          <w:tab w:val="left" w:pos="10076"/>
+          <w:tab w:val="left" w:pos="10992"/>
+          <w:tab w:val="left" w:pos="11908"/>
+          <w:tab w:val="left" w:pos="12824"/>
+          <w:tab w:val="left" w:pos="13740"/>
+          <w:tab w:val="left" w:pos="14656"/>
+        </w:tabs>
+        <w:spacing w:after="0" w:line="240" w:lineRule="auto"/>
+        <w:rPr>
+          <w:rFonts w:ascii="Courier New" w:eastAsia="Times New Roman" w:hAnsi="Courier New" w:cs="Courier New"/>
+          <w:sz w:val="20"/>
+          <w:szCs w:val="20"/>
+          <w:lang w:eastAsia="en-AU"/>
+        </w:rPr>
+      </w:pPr>
+      <w:r>
+        <w:rPr>
+          <w:rFonts w:ascii="Courier New" w:eastAsia="Times New Roman" w:hAnsi="Courier New" w:cs="Courier New"/>
+          <w:sz w:val="20"/>
+          <w:szCs w:val="20"/>
+          <w:lang w:eastAsia="en-AU"/>
+        </w:rPr>
+        <w:t xml:space="preserve">    '&lt;session-</w:t>
+      </w:r>
+      <w:proofErr w:type="spellStart"/>
+      <w:r>
+        <w:rPr>
+          <w:rFonts w:ascii="Courier New" w:eastAsia="Times New Roman" w:hAnsi="Courier New" w:cs="Courier New"/>
+          <w:sz w:val="20"/>
+          <w:szCs w:val="20"/>
+          <w:lang w:eastAsia="en-AU"/>
+        </w:rPr>
+        <w:t>uuid</w:t>
+      </w:r>
+      <w:proofErr w:type="spellEnd"/>
       <w:r>
         <w:rPr>
           <w:rFonts w:ascii="Courier New" w:eastAsia="Times New Roman" w:hAnsi="Courier New" w:cs="Courier New"/>
@@ -3343,74 +3680,112 @@
           <w:szCs w:val="20"/>
           <w:lang w:eastAsia="en-AU"/>
         </w:rPr>
-        <w:t>-- Then calculate and persist dashboard scores:</w:t>
-      </w:r>
-    </w:p>
-    <w:p>
-      <w:pPr>
-        <w:tabs>
-          <w:tab w:val="left" w:pos="916"/>
-          <w:tab w:val="left" w:pos="1832"/>
-          <w:tab w:val="left" w:pos="2748"/>
-          <w:tab w:val="left" w:pos="3664"/>
-          <w:tab w:val="left" w:pos="4580"/>
-          <w:tab w:val="left" w:pos="5496"/>
-          <w:tab w:val="left" w:pos="6412"/>
-          <w:tab w:val="left" w:pos="7328"/>
-          <w:tab w:val="left" w:pos="8244"/>
-          <w:tab w:val="left" w:pos="9160"/>
-          <w:tab w:val="left" w:pos="10076"/>
-          <w:tab w:val="left" w:pos="10992"/>
-          <w:tab w:val="left" w:pos="11908"/>
-          <w:tab w:val="left" w:pos="12824"/>
-          <w:tab w:val="left" w:pos="13740"/>
-          <w:tab w:val="left" w:pos="14656"/>
-        </w:tabs>
-        <w:spacing w:after="0" w:line="240" w:lineRule="auto"/>
-        <w:rPr>
-          <w:rFonts w:ascii="Courier New" w:eastAsia="Times New Roman" w:hAnsi="Courier New" w:cs="Courier New"/>
-          <w:sz w:val="20"/>
-          <w:szCs w:val="20"/>
-          <w:lang w:eastAsia="en-AU"/>
-        </w:rPr>
-      </w:pPr>
-    </w:p>
-    <w:p>
-      <w:pPr>
-        <w:tabs>
-          <w:tab w:val="left" w:pos="916"/>
-          <w:tab w:val="left" w:pos="1832"/>
-          <w:tab w:val="left" w:pos="2748"/>
-          <w:tab w:val="left" w:pos="3664"/>
-          <w:tab w:val="left" w:pos="4580"/>
-          <w:tab w:val="left" w:pos="5496"/>
-          <w:tab w:val="left" w:pos="6412"/>
-          <w:tab w:val="left" w:pos="7328"/>
-          <w:tab w:val="left" w:pos="8244"/>
-          <w:tab w:val="left" w:pos="9160"/>
-          <w:tab w:val="left" w:pos="10076"/>
-          <w:tab w:val="left" w:pos="10992"/>
-          <w:tab w:val="left" w:pos="11908"/>
-          <w:tab w:val="left" w:pos="12824"/>
-          <w:tab w:val="left" w:pos="13740"/>
-          <w:tab w:val="left" w:pos="14656"/>
-        </w:tabs>
-        <w:spacing w:after="0" w:line="240" w:lineRule="auto"/>
-        <w:rPr>
-          <w:rFonts w:ascii="Courier New" w:eastAsia="Times New Roman" w:hAnsi="Courier New" w:cs="Courier New"/>
-          <w:sz w:val="20"/>
-          <w:szCs w:val="20"/>
-          <w:lang w:eastAsia="en-AU"/>
-        </w:rPr>
-      </w:pPr>
-      <w:r>
-        <w:rPr>
-          <w:rFonts w:ascii="Courier New" w:eastAsia="Times New Roman" w:hAnsi="Courier New" w:cs="Courier New"/>
-          <w:sz w:val="20"/>
-          <w:szCs w:val="20"/>
-          <w:lang w:eastAsia="en-AU"/>
-        </w:rPr>
-        <w:t xml:space="preserve">CALL </w:t>
+        <w:t>-- Read the current active dashboard dimensions:</w:t>
+      </w:r>
+    </w:p>
+    <w:p>
+      <w:pPr>
+        <w:tabs>
+          <w:tab w:val="left" w:pos="916"/>
+          <w:tab w:val="left" w:pos="1832"/>
+          <w:tab w:val="left" w:pos="2748"/>
+          <w:tab w:val="left" w:pos="3664"/>
+          <w:tab w:val="left" w:pos="4580"/>
+          <w:tab w:val="left" w:pos="5496"/>
+          <w:tab w:val="left" w:pos="6412"/>
+          <w:tab w:val="left" w:pos="7328"/>
+          <w:tab w:val="left" w:pos="8244"/>
+          <w:tab w:val="left" w:pos="9160"/>
+          <w:tab w:val="left" w:pos="10076"/>
+          <w:tab w:val="left" w:pos="10992"/>
+          <w:tab w:val="left" w:pos="11908"/>
+          <w:tab w:val="left" w:pos="12824"/>
+          <w:tab w:val="left" w:pos="13740"/>
+          <w:tab w:val="left" w:pos="14656"/>
+        </w:tabs>
+        <w:spacing w:after="0" w:line="240" w:lineRule="auto"/>
+        <w:rPr>
+          <w:rFonts w:ascii="Courier New" w:eastAsia="Times New Roman" w:hAnsi="Courier New" w:cs="Courier New"/>
+          <w:sz w:val="20"/>
+          <w:szCs w:val="20"/>
+          <w:lang w:eastAsia="en-AU"/>
+        </w:rPr>
+      </w:pPr>
+    </w:p>
+    <w:p>
+      <w:pPr>
+        <w:tabs>
+          <w:tab w:val="left" w:pos="916"/>
+          <w:tab w:val="left" w:pos="1832"/>
+          <w:tab w:val="left" w:pos="2748"/>
+          <w:tab w:val="left" w:pos="3664"/>
+          <w:tab w:val="left" w:pos="4580"/>
+          <w:tab w:val="left" w:pos="5496"/>
+          <w:tab w:val="left" w:pos="6412"/>
+          <w:tab w:val="left" w:pos="7328"/>
+          <w:tab w:val="left" w:pos="8244"/>
+          <w:tab w:val="left" w:pos="9160"/>
+          <w:tab w:val="left" w:pos="10076"/>
+          <w:tab w:val="left" w:pos="10992"/>
+          <w:tab w:val="left" w:pos="11908"/>
+          <w:tab w:val="left" w:pos="12824"/>
+          <w:tab w:val="left" w:pos="13740"/>
+          <w:tab w:val="left" w:pos="14656"/>
+        </w:tabs>
+        <w:spacing w:after="0" w:line="240" w:lineRule="auto"/>
+        <w:rPr>
+          <w:rFonts w:ascii="Courier New" w:eastAsia="Times New Roman" w:hAnsi="Courier New" w:cs="Courier New"/>
+          <w:sz w:val="20"/>
+          <w:szCs w:val="20"/>
+          <w:lang w:eastAsia="en-AU"/>
+        </w:rPr>
+      </w:pPr>
+      <w:r>
+        <w:rPr>
+          <w:rFonts w:ascii="Courier New" w:eastAsia="Times New Roman" w:hAnsi="Courier New" w:cs="Courier New"/>
+          <w:sz w:val="20"/>
+          <w:szCs w:val="20"/>
+          <w:lang w:eastAsia="en-AU"/>
+        </w:rPr>
+        <w:t>SELECT *</w:t>
+      </w:r>
+    </w:p>
+    <w:p>
+      <w:pPr>
+        <w:tabs>
+          <w:tab w:val="left" w:pos="916"/>
+          <w:tab w:val="left" w:pos="1832"/>
+          <w:tab w:val="left" w:pos="2748"/>
+          <w:tab w:val="left" w:pos="3664"/>
+          <w:tab w:val="left" w:pos="4580"/>
+          <w:tab w:val="left" w:pos="5496"/>
+          <w:tab w:val="left" w:pos="6412"/>
+          <w:tab w:val="left" w:pos="7328"/>
+          <w:tab w:val="left" w:pos="8244"/>
+          <w:tab w:val="left" w:pos="9160"/>
+          <w:tab w:val="left" w:pos="10076"/>
+          <w:tab w:val="left" w:pos="10992"/>
+          <w:tab w:val="left" w:pos="11908"/>
+          <w:tab w:val="left" w:pos="12824"/>
+          <w:tab w:val="left" w:pos="13740"/>
+          <w:tab w:val="left" w:pos="14656"/>
+        </w:tabs>
+        <w:spacing w:after="0" w:line="240" w:lineRule="auto"/>
+        <w:rPr>
+          <w:rFonts w:ascii="Courier New" w:eastAsia="Times New Roman" w:hAnsi="Courier New" w:cs="Courier New"/>
+          <w:sz w:val="20"/>
+          <w:szCs w:val="20"/>
+          <w:lang w:eastAsia="en-AU"/>
+        </w:rPr>
+      </w:pPr>
+      <w:r>
+        <w:rPr>
+          <w:rFonts w:ascii="Courier New" w:eastAsia="Times New Roman" w:hAnsi="Courier New" w:cs="Courier New"/>
+          <w:sz w:val="20"/>
+          <w:szCs w:val="20"/>
+          <w:lang w:eastAsia="en-AU"/>
+        </w:rPr>
+        <w:t xml:space="preserve">FROM </w:t>
       </w:r>
       <w:proofErr w:type="spellStart"/>
       <w:r>
@@ -3420,76 +3795,46 @@
           <w:szCs w:val="20"/>
           <w:lang w:eastAsia="en-AU"/>
         </w:rPr>
-        <w:t>reddust.refresh_soul_score_</w:t>
-      </w:r>
-      <w:proofErr w:type="gramStart"/>
-      <w:r>
-        <w:rPr>
-          <w:rFonts w:ascii="Courier New" w:eastAsia="Times New Roman" w:hAnsi="Courier New" w:cs="Courier New"/>
-          <w:sz w:val="20"/>
-          <w:szCs w:val="20"/>
-          <w:lang w:eastAsia="en-AU"/>
-        </w:rPr>
-        <w:t>snapshot</w:t>
+        <w:t>reddust.v_user_dashboard_soul_score</w:t>
       </w:r>
       <w:proofErr w:type="spellEnd"/>
-      <w:r>
-        <w:rPr>
-          <w:rFonts w:ascii="Courier New" w:eastAsia="Times New Roman" w:hAnsi="Courier New" w:cs="Courier New"/>
-          <w:sz w:val="20"/>
-          <w:szCs w:val="20"/>
-          <w:lang w:eastAsia="en-AU"/>
-        </w:rPr>
-        <w:t>(</w:t>
-      </w:r>
-      <w:proofErr w:type="gramEnd"/>
-    </w:p>
-    <w:p>
-      <w:pPr>
-        <w:tabs>
-          <w:tab w:val="left" w:pos="916"/>
-          <w:tab w:val="left" w:pos="1832"/>
-          <w:tab w:val="left" w:pos="2748"/>
-          <w:tab w:val="left" w:pos="3664"/>
-          <w:tab w:val="left" w:pos="4580"/>
-          <w:tab w:val="left" w:pos="5496"/>
-          <w:tab w:val="left" w:pos="6412"/>
-          <w:tab w:val="left" w:pos="7328"/>
-          <w:tab w:val="left" w:pos="8244"/>
-          <w:tab w:val="left" w:pos="9160"/>
-          <w:tab w:val="left" w:pos="10076"/>
-          <w:tab w:val="left" w:pos="10992"/>
-          <w:tab w:val="left" w:pos="11908"/>
-          <w:tab w:val="left" w:pos="12824"/>
-          <w:tab w:val="left" w:pos="13740"/>
-          <w:tab w:val="left" w:pos="14656"/>
-        </w:tabs>
-        <w:spacing w:after="0" w:line="240" w:lineRule="auto"/>
-        <w:rPr>
-          <w:rFonts w:ascii="Courier New" w:eastAsia="Times New Roman" w:hAnsi="Courier New" w:cs="Courier New"/>
-          <w:sz w:val="20"/>
-          <w:szCs w:val="20"/>
-          <w:lang w:eastAsia="en-AU"/>
-        </w:rPr>
-      </w:pPr>
-      <w:r>
-        <w:rPr>
-          <w:rFonts w:ascii="Courier New" w:eastAsia="Times New Roman" w:hAnsi="Courier New" w:cs="Courier New"/>
-          <w:sz w:val="20"/>
-          <w:szCs w:val="20"/>
-          <w:lang w:eastAsia="en-AU"/>
-        </w:rPr>
-        <w:t xml:space="preserve">    '&lt;</w:t>
-      </w:r>
-      <w:proofErr w:type="gramStart"/>
-      <w:r>
-        <w:rPr>
-          <w:rFonts w:ascii="Courier New" w:eastAsia="Times New Roman" w:hAnsi="Courier New" w:cs="Courier New"/>
-          <w:sz w:val="20"/>
-          <w:szCs w:val="20"/>
-          <w:lang w:eastAsia="en-AU"/>
-        </w:rPr>
-        <w:t>user-</w:t>
+    </w:p>
+    <w:p>
+      <w:pPr>
+        <w:tabs>
+          <w:tab w:val="left" w:pos="916"/>
+          <w:tab w:val="left" w:pos="1832"/>
+          <w:tab w:val="left" w:pos="2748"/>
+          <w:tab w:val="left" w:pos="3664"/>
+          <w:tab w:val="left" w:pos="4580"/>
+          <w:tab w:val="left" w:pos="5496"/>
+          <w:tab w:val="left" w:pos="6412"/>
+          <w:tab w:val="left" w:pos="7328"/>
+          <w:tab w:val="left" w:pos="8244"/>
+          <w:tab w:val="left" w:pos="9160"/>
+          <w:tab w:val="left" w:pos="10076"/>
+          <w:tab w:val="left" w:pos="10992"/>
+          <w:tab w:val="left" w:pos="11908"/>
+          <w:tab w:val="left" w:pos="12824"/>
+          <w:tab w:val="left" w:pos="13740"/>
+          <w:tab w:val="left" w:pos="14656"/>
+        </w:tabs>
+        <w:spacing w:after="0" w:line="240" w:lineRule="auto"/>
+        <w:rPr>
+          <w:rFonts w:ascii="Courier New" w:eastAsia="Times New Roman" w:hAnsi="Courier New" w:cs="Courier New"/>
+          <w:sz w:val="20"/>
+          <w:szCs w:val="20"/>
+          <w:lang w:eastAsia="en-AU"/>
+        </w:rPr>
+      </w:pPr>
+      <w:r>
+        <w:rPr>
+          <w:rFonts w:ascii="Courier New" w:eastAsia="Times New Roman" w:hAnsi="Courier New" w:cs="Courier New"/>
+          <w:sz w:val="20"/>
+          <w:szCs w:val="20"/>
+          <w:lang w:eastAsia="en-AU"/>
+        </w:rPr>
+        <w:t xml:space="preserve">WHERE </w:t>
       </w:r>
       <w:proofErr w:type="spellStart"/>
       <w:r>
@@ -3499,346 +3844,17 @@
           <w:szCs w:val="20"/>
           <w:lang w:eastAsia="en-AU"/>
         </w:rPr>
-        <w:t>uuid</w:t>
+        <w:t>user_id</w:t>
       </w:r>
       <w:proofErr w:type="spellEnd"/>
-      <w:proofErr w:type="gramEnd"/>
-      <w:r>
-        <w:rPr>
-          <w:rFonts w:ascii="Courier New" w:eastAsia="Times New Roman" w:hAnsi="Courier New" w:cs="Courier New"/>
-          <w:sz w:val="20"/>
-          <w:szCs w:val="20"/>
-          <w:lang w:eastAsia="en-AU"/>
-        </w:rPr>
-        <w:t>&gt;',</w:t>
-      </w:r>
-    </w:p>
-    <w:p>
-      <w:pPr>
-        <w:tabs>
-          <w:tab w:val="left" w:pos="916"/>
-          <w:tab w:val="left" w:pos="1832"/>
-          <w:tab w:val="left" w:pos="2748"/>
-          <w:tab w:val="left" w:pos="3664"/>
-          <w:tab w:val="left" w:pos="4580"/>
-          <w:tab w:val="left" w:pos="5496"/>
-          <w:tab w:val="left" w:pos="6412"/>
-          <w:tab w:val="left" w:pos="7328"/>
-          <w:tab w:val="left" w:pos="8244"/>
-          <w:tab w:val="left" w:pos="9160"/>
-          <w:tab w:val="left" w:pos="10076"/>
-          <w:tab w:val="left" w:pos="10992"/>
-          <w:tab w:val="left" w:pos="11908"/>
-          <w:tab w:val="left" w:pos="12824"/>
-          <w:tab w:val="left" w:pos="13740"/>
-          <w:tab w:val="left" w:pos="14656"/>
-        </w:tabs>
-        <w:spacing w:after="0" w:line="240" w:lineRule="auto"/>
-        <w:rPr>
-          <w:rFonts w:ascii="Courier New" w:eastAsia="Times New Roman" w:hAnsi="Courier New" w:cs="Courier New"/>
-          <w:sz w:val="20"/>
-          <w:szCs w:val="20"/>
-          <w:lang w:eastAsia="en-AU"/>
-        </w:rPr>
-      </w:pPr>
-      <w:r>
-        <w:rPr>
-          <w:rFonts w:ascii="Courier New" w:eastAsia="Times New Roman" w:hAnsi="Courier New" w:cs="Courier New"/>
-          <w:sz w:val="20"/>
-          <w:szCs w:val="20"/>
-          <w:lang w:eastAsia="en-AU"/>
-        </w:rPr>
-        <w:t xml:space="preserve">    '&lt;</w:t>
-      </w:r>
-      <w:proofErr w:type="gramStart"/>
-      <w:r>
-        <w:rPr>
-          <w:rFonts w:ascii="Courier New" w:eastAsia="Times New Roman" w:hAnsi="Courier New" w:cs="Courier New"/>
-          <w:sz w:val="20"/>
-          <w:szCs w:val="20"/>
-          <w:lang w:eastAsia="en-AU"/>
-        </w:rPr>
-        <w:t>session-</w:t>
-      </w:r>
-      <w:proofErr w:type="spellStart"/>
-      <w:r>
-        <w:rPr>
-          <w:rFonts w:ascii="Courier New" w:eastAsia="Times New Roman" w:hAnsi="Courier New" w:cs="Courier New"/>
-          <w:sz w:val="20"/>
-          <w:szCs w:val="20"/>
-          <w:lang w:eastAsia="en-AU"/>
-        </w:rPr>
-        <w:t>uuid</w:t>
-      </w:r>
-      <w:proofErr w:type="spellEnd"/>
-      <w:proofErr w:type="gramEnd"/>
-      <w:r>
-        <w:rPr>
-          <w:rFonts w:ascii="Courier New" w:eastAsia="Times New Roman" w:hAnsi="Courier New" w:cs="Courier New"/>
-          <w:sz w:val="20"/>
-          <w:szCs w:val="20"/>
-          <w:lang w:eastAsia="en-AU"/>
-        </w:rPr>
-        <w:t>&gt;'</w:t>
-      </w:r>
-    </w:p>
-    <w:p>
-      <w:pPr>
-        <w:tabs>
-          <w:tab w:val="left" w:pos="916"/>
-          <w:tab w:val="left" w:pos="1832"/>
-          <w:tab w:val="left" w:pos="2748"/>
-          <w:tab w:val="left" w:pos="3664"/>
-          <w:tab w:val="left" w:pos="4580"/>
-          <w:tab w:val="left" w:pos="5496"/>
-          <w:tab w:val="left" w:pos="6412"/>
-          <w:tab w:val="left" w:pos="7328"/>
-          <w:tab w:val="left" w:pos="8244"/>
-          <w:tab w:val="left" w:pos="9160"/>
-          <w:tab w:val="left" w:pos="10076"/>
-          <w:tab w:val="left" w:pos="10992"/>
-          <w:tab w:val="left" w:pos="11908"/>
-          <w:tab w:val="left" w:pos="12824"/>
-          <w:tab w:val="left" w:pos="13740"/>
-          <w:tab w:val="left" w:pos="14656"/>
-        </w:tabs>
-        <w:spacing w:after="0" w:line="240" w:lineRule="auto"/>
-        <w:rPr>
-          <w:rFonts w:ascii="Courier New" w:eastAsia="Times New Roman" w:hAnsi="Courier New" w:cs="Courier New"/>
-          <w:sz w:val="20"/>
-          <w:szCs w:val="20"/>
-          <w:lang w:eastAsia="en-AU"/>
-        </w:rPr>
-      </w:pPr>
-      <w:r>
-        <w:rPr>
-          <w:rFonts w:ascii="Courier New" w:eastAsia="Times New Roman" w:hAnsi="Courier New" w:cs="Courier New"/>
-          <w:sz w:val="20"/>
-          <w:szCs w:val="20"/>
-          <w:lang w:eastAsia="en-AU"/>
-        </w:rPr>
-        <w:t>);</w:t>
-      </w:r>
-    </w:p>
-    <w:p>
-      <w:pPr>
-        <w:tabs>
-          <w:tab w:val="left" w:pos="916"/>
-          <w:tab w:val="left" w:pos="1832"/>
-          <w:tab w:val="left" w:pos="2748"/>
-          <w:tab w:val="left" w:pos="3664"/>
-          <w:tab w:val="left" w:pos="4580"/>
-          <w:tab w:val="left" w:pos="5496"/>
-          <w:tab w:val="left" w:pos="6412"/>
-          <w:tab w:val="left" w:pos="7328"/>
-          <w:tab w:val="left" w:pos="8244"/>
-          <w:tab w:val="left" w:pos="9160"/>
-          <w:tab w:val="left" w:pos="10076"/>
-          <w:tab w:val="left" w:pos="10992"/>
-          <w:tab w:val="left" w:pos="11908"/>
-          <w:tab w:val="left" w:pos="12824"/>
-          <w:tab w:val="left" w:pos="13740"/>
-          <w:tab w:val="left" w:pos="14656"/>
-        </w:tabs>
-        <w:spacing w:after="0" w:line="240" w:lineRule="auto"/>
-        <w:rPr>
-          <w:rFonts w:ascii="Courier New" w:eastAsia="Times New Roman" w:hAnsi="Courier New" w:cs="Courier New"/>
-          <w:sz w:val="20"/>
-          <w:szCs w:val="20"/>
-          <w:lang w:eastAsia="en-AU"/>
-        </w:rPr>
-      </w:pPr>
-    </w:p>
-    <w:p>
-      <w:pPr>
-        <w:tabs>
-          <w:tab w:val="left" w:pos="916"/>
-          <w:tab w:val="left" w:pos="1832"/>
-          <w:tab w:val="left" w:pos="2748"/>
-          <w:tab w:val="left" w:pos="3664"/>
-          <w:tab w:val="left" w:pos="4580"/>
-          <w:tab w:val="left" w:pos="5496"/>
-          <w:tab w:val="left" w:pos="6412"/>
-          <w:tab w:val="left" w:pos="7328"/>
-          <w:tab w:val="left" w:pos="8244"/>
-          <w:tab w:val="left" w:pos="9160"/>
-          <w:tab w:val="left" w:pos="10076"/>
-          <w:tab w:val="left" w:pos="10992"/>
-          <w:tab w:val="left" w:pos="11908"/>
-          <w:tab w:val="left" w:pos="12824"/>
-          <w:tab w:val="left" w:pos="13740"/>
-          <w:tab w:val="left" w:pos="14656"/>
-        </w:tabs>
-        <w:spacing w:after="0" w:line="240" w:lineRule="auto"/>
-        <w:rPr>
-          <w:rFonts w:ascii="Courier New" w:eastAsia="Times New Roman" w:hAnsi="Courier New" w:cs="Courier New"/>
-          <w:sz w:val="20"/>
-          <w:szCs w:val="20"/>
-          <w:lang w:eastAsia="en-AU"/>
-        </w:rPr>
-      </w:pPr>
-      <w:r>
-        <w:rPr>
-          <w:rFonts w:ascii="Courier New" w:eastAsia="Times New Roman" w:hAnsi="Courier New" w:cs="Courier New"/>
-          <w:sz w:val="20"/>
-          <w:szCs w:val="20"/>
-          <w:lang w:eastAsia="en-AU"/>
-        </w:rPr>
-        <w:t>-- Read the current active dashboard dimensions:</w:t>
-      </w:r>
-    </w:p>
-    <w:p>
-      <w:pPr>
-        <w:tabs>
-          <w:tab w:val="left" w:pos="916"/>
-          <w:tab w:val="left" w:pos="1832"/>
-          <w:tab w:val="left" w:pos="2748"/>
-          <w:tab w:val="left" w:pos="3664"/>
-          <w:tab w:val="left" w:pos="4580"/>
-          <w:tab w:val="left" w:pos="5496"/>
-          <w:tab w:val="left" w:pos="6412"/>
-          <w:tab w:val="left" w:pos="7328"/>
-          <w:tab w:val="left" w:pos="8244"/>
-          <w:tab w:val="left" w:pos="9160"/>
-          <w:tab w:val="left" w:pos="10076"/>
-          <w:tab w:val="left" w:pos="10992"/>
-          <w:tab w:val="left" w:pos="11908"/>
-          <w:tab w:val="left" w:pos="12824"/>
-          <w:tab w:val="left" w:pos="13740"/>
-          <w:tab w:val="left" w:pos="14656"/>
-        </w:tabs>
-        <w:spacing w:after="0" w:line="240" w:lineRule="auto"/>
-        <w:rPr>
-          <w:rFonts w:ascii="Courier New" w:eastAsia="Times New Roman" w:hAnsi="Courier New" w:cs="Courier New"/>
-          <w:sz w:val="20"/>
-          <w:szCs w:val="20"/>
-          <w:lang w:eastAsia="en-AU"/>
-        </w:rPr>
-      </w:pPr>
-    </w:p>
-    <w:p>
-      <w:pPr>
-        <w:tabs>
-          <w:tab w:val="left" w:pos="916"/>
-          <w:tab w:val="left" w:pos="1832"/>
-          <w:tab w:val="left" w:pos="2748"/>
-          <w:tab w:val="left" w:pos="3664"/>
-          <w:tab w:val="left" w:pos="4580"/>
-          <w:tab w:val="left" w:pos="5496"/>
-          <w:tab w:val="left" w:pos="6412"/>
-          <w:tab w:val="left" w:pos="7328"/>
-          <w:tab w:val="left" w:pos="8244"/>
-          <w:tab w:val="left" w:pos="9160"/>
-          <w:tab w:val="left" w:pos="10076"/>
-          <w:tab w:val="left" w:pos="10992"/>
-          <w:tab w:val="left" w:pos="11908"/>
-          <w:tab w:val="left" w:pos="12824"/>
-          <w:tab w:val="left" w:pos="13740"/>
-          <w:tab w:val="left" w:pos="14656"/>
-        </w:tabs>
-        <w:spacing w:after="0" w:line="240" w:lineRule="auto"/>
-        <w:rPr>
-          <w:rFonts w:ascii="Courier New" w:eastAsia="Times New Roman" w:hAnsi="Courier New" w:cs="Courier New"/>
-          <w:sz w:val="20"/>
-          <w:szCs w:val="20"/>
-          <w:lang w:eastAsia="en-AU"/>
-        </w:rPr>
-      </w:pPr>
-      <w:r>
-        <w:rPr>
-          <w:rFonts w:ascii="Courier New" w:eastAsia="Times New Roman" w:hAnsi="Courier New" w:cs="Courier New"/>
-          <w:sz w:val="20"/>
-          <w:szCs w:val="20"/>
-          <w:lang w:eastAsia="en-AU"/>
-        </w:rPr>
-        <w:t>SELECT *</w:t>
-      </w:r>
-    </w:p>
-    <w:p>
-      <w:pPr>
-        <w:tabs>
-          <w:tab w:val="left" w:pos="916"/>
-          <w:tab w:val="left" w:pos="1832"/>
-          <w:tab w:val="left" w:pos="2748"/>
-          <w:tab w:val="left" w:pos="3664"/>
-          <w:tab w:val="left" w:pos="4580"/>
-          <w:tab w:val="left" w:pos="5496"/>
-          <w:tab w:val="left" w:pos="6412"/>
-          <w:tab w:val="left" w:pos="7328"/>
-          <w:tab w:val="left" w:pos="8244"/>
-          <w:tab w:val="left" w:pos="9160"/>
-          <w:tab w:val="left" w:pos="10076"/>
-          <w:tab w:val="left" w:pos="10992"/>
-          <w:tab w:val="left" w:pos="11908"/>
-          <w:tab w:val="left" w:pos="12824"/>
-          <w:tab w:val="left" w:pos="13740"/>
-          <w:tab w:val="left" w:pos="14656"/>
-        </w:tabs>
-        <w:spacing w:after="0" w:line="240" w:lineRule="auto"/>
-        <w:rPr>
-          <w:rFonts w:ascii="Courier New" w:eastAsia="Times New Roman" w:hAnsi="Courier New" w:cs="Courier New"/>
-          <w:sz w:val="20"/>
-          <w:szCs w:val="20"/>
-          <w:lang w:eastAsia="en-AU"/>
-        </w:rPr>
-      </w:pPr>
-      <w:r>
-        <w:rPr>
-          <w:rFonts w:ascii="Courier New" w:eastAsia="Times New Roman" w:hAnsi="Courier New" w:cs="Courier New"/>
-          <w:sz w:val="20"/>
-          <w:szCs w:val="20"/>
-          <w:lang w:eastAsia="en-AU"/>
-        </w:rPr>
-        <w:t xml:space="preserve">FROM </w:t>
-      </w:r>
-      <w:proofErr w:type="spellStart"/>
-      <w:r>
-        <w:rPr>
-          <w:rFonts w:ascii="Courier New" w:eastAsia="Times New Roman" w:hAnsi="Courier New" w:cs="Courier New"/>
-          <w:sz w:val="20"/>
-          <w:szCs w:val="20"/>
-          <w:lang w:eastAsia="en-AU"/>
-        </w:rPr>
-        <w:t>reddust.v_user_dashboard_soul_score</w:t>
-      </w:r>
-      <w:proofErr w:type="spellEnd"/>
-    </w:p>
-    <w:p>
-      <w:pPr>
-        <w:tabs>
-          <w:tab w:val="left" w:pos="916"/>
-          <w:tab w:val="left" w:pos="1832"/>
-          <w:tab w:val="left" w:pos="2748"/>
-          <w:tab w:val="left" w:pos="3664"/>
-          <w:tab w:val="left" w:pos="4580"/>
-          <w:tab w:val="left" w:pos="5496"/>
-          <w:tab w:val="left" w:pos="6412"/>
-          <w:tab w:val="left" w:pos="7328"/>
-          <w:tab w:val="left" w:pos="8244"/>
-          <w:tab w:val="left" w:pos="9160"/>
-          <w:tab w:val="left" w:pos="10076"/>
-          <w:tab w:val="left" w:pos="10992"/>
-          <w:tab w:val="left" w:pos="11908"/>
-          <w:tab w:val="left" w:pos="12824"/>
-          <w:tab w:val="left" w:pos="13740"/>
-          <w:tab w:val="left" w:pos="14656"/>
-        </w:tabs>
-        <w:spacing w:after="0" w:line="240" w:lineRule="auto"/>
-        <w:rPr>
-          <w:rFonts w:ascii="Courier New" w:eastAsia="Times New Roman" w:hAnsi="Courier New" w:cs="Courier New"/>
-          <w:sz w:val="20"/>
-          <w:szCs w:val="20"/>
-          <w:lang w:eastAsia="en-AU"/>
-        </w:rPr>
-      </w:pPr>
-      <w:r>
-        <w:rPr>
-          <w:rFonts w:ascii="Courier New" w:eastAsia="Times New Roman" w:hAnsi="Courier New" w:cs="Courier New"/>
-          <w:sz w:val="20"/>
-          <w:szCs w:val="20"/>
-          <w:lang w:eastAsia="en-AU"/>
-        </w:rPr>
-        <w:t>WHERE user_id = '&lt;user-</w:t>
+      <w:r>
+        <w:rPr>
+          <w:rFonts w:ascii="Courier New" w:eastAsia="Times New Roman" w:hAnsi="Courier New" w:cs="Courier New"/>
+          <w:sz w:val="20"/>
+          <w:szCs w:val="20"/>
+          <w:lang w:eastAsia="en-AU"/>
+        </w:rPr>
+        <w:t xml:space="preserve"> = '&lt;user-</w:t>
       </w:r>
       <w:proofErr w:type="spellStart"/>
       <w:r>
@@ -4616,7 +4632,6 @@
           <w:szCs w:val="20"/>
           <w:lang w:eastAsia="en-AU"/>
         </w:rPr>
-        <w:lastRenderedPageBreak/>
         <w:t>Session Recovery = 61</w:t>
       </w:r>
     </w:p>
@@ -5042,10 +5057,7 @@
         <w:t xml:space="preserve"> a particular dimension was promoted to the dashboard, rather than only displaying a mysterious number. </w:t>
       </w:r>
     </w:p>
-    <w:p>
-      <w:bookmarkStart w:id="0" w:name="_GoBack"/>
-      <w:bookmarkEnd w:id="0"/>
-    </w:p>
+    <w:p/>
     <w:sectPr>
       <w:pgSz w:w="11906" w:h="16838"/>
       <w:pgMar w:top="1440" w:right="1440" w:bottom="1440" w:left="1440" w:header="708" w:footer="708" w:gutter="0"/>
@@ -5057,7 +5069,7 @@
 </file>
 
 <file path=word/styles.xml><?xml version="1.0" encoding="utf-8"?>
-<w:styles xmlns:mc="http://schemas.openxmlformats.org/markup-compatibility/2006" xmlns:r="http://schemas.openxmlformats.org/officeDocument/2006/relationships" xmlns:w="http://schemas.openxmlformats.org/wordprocessingml/2006/main" xmlns:w14="http://schemas.microsoft.com/office/word/2010/wordml" xmlns:w15="http://schemas.microsoft.com/office/word/2012/wordml" mc:Ignorable="w14 w15">
+<w:styles xmlns:mc="http://schemas.openxmlformats.org/markup-compatibility/2006" xmlns:r="http://schemas.openxmlformats.org/officeDocument/2006/relationships" xmlns:w="http://schemas.openxmlformats.org/wordprocessingml/2006/main" xmlns:w14="http://schemas.microsoft.com/office/word/2010/wordml" xmlns:w15="http://schemas.microsoft.com/office/word/2012/wordml" xmlns:w16cex="http://schemas.microsoft.com/office/word/2018/wordml/cex" xmlns:w16cid="http://schemas.microsoft.com/office/word/2016/wordml/cid" xmlns:w16="http://schemas.microsoft.com/office/word/2018/wordml" xmlns:w16du="http://schemas.microsoft.com/office/word/2023/wordml/word16du" xmlns:w16sdtdh="http://schemas.microsoft.com/office/word/2020/wordml/sdtdatahash" xmlns:w16sdtfl="http://schemas.microsoft.com/office/word/2024/wordml/sdtformatlock" xmlns:w16se="http://schemas.microsoft.com/office/word/2015/wordml/symex" mc:Ignorable="w14 w15 w16se w16cid w16 w16cex w16sdtdh w16sdtfl w16du">
   <w:docDefaults>
     <w:rPrDefault>
       <w:rPr>
@@ -5073,7 +5085,7 @@
       </w:pPr>
     </w:pPrDefault>
   </w:docDefaults>
-  <w:latentStyles w:defLockedState="0" w:defUIPriority="99" w:defSemiHidden="0" w:defUnhideWhenUsed="0" w:defQFormat="0" w:count="371">
+  <w:latentStyles w:defLockedState="0" w:defUIPriority="99" w:defSemiHidden="0" w:defUnhideWhenUsed="0" w:defQFormat="0" w:count="376">
     <w:lsdException w:name="Normal" w:uiPriority="0" w:qFormat="1"/>
     <w:lsdException w:name="heading 1" w:uiPriority="9" w:qFormat="1"/>
     <w:lsdException w:name="heading 2" w:semiHidden="1" w:uiPriority="9" w:unhideWhenUsed="1" w:qFormat="1"/>
@@ -5445,6 +5457,11 @@
     <w:lsdException w:name="List Table 5 Dark Accent 6" w:uiPriority="50"/>
     <w:lsdException w:name="List Table 6 Colorful Accent 6" w:uiPriority="51"/>
     <w:lsdException w:name="List Table 7 Colorful Accent 6" w:uiPriority="52"/>
+    <w:lsdException w:name="Mention" w:semiHidden="1" w:unhideWhenUsed="1"/>
+    <w:lsdException w:name="Smart Hyperlink" w:semiHidden="1" w:unhideWhenUsed="1"/>
+    <w:lsdException w:name="Hashtag" w:semiHidden="1" w:unhideWhenUsed="1"/>
+    <w:lsdException w:name="Unresolved Mention" w:semiHidden="1" w:unhideWhenUsed="1"/>
+    <w:lsdException w:name="Smart Link" w:semiHidden="1" w:unhideWhenUsed="1"/>
   </w:latentStyles>
   <w:style w:type="paragraph" w:default="1" w:styleId="Normal">
     <w:name w:val="Normal"/>

</xml_diff>